<commit_message>
Update assignment 1 and air density example
</commit_message>
<xml_diff>
--- a/Assignments/Physics 441 Assignments 1.docx
+++ b/Assignments/Physics 441 Assignments 1.docx
@@ -71,7 +71,7 @@
           <w:sz w:val="22"/>
           <w:szCs w:val="22"/>
         </w:rPr>
-        <w:t>Floating Point Binary Representation</w:t>
+        <w:t>Numerical Differentiation and Convergence</w:t>
       </w:r>
     </w:p>
     <w:p>
@@ -87,7 +87,7 @@
           <w:sz w:val="22"/>
           <w:szCs w:val="22"/>
         </w:rPr>
-        <w:t>Modify the Jupyter Notebook called:</w:t>
+        <w:t>Using the Jupyter Notebook called:</w:t>
       </w:r>
       <w:proofErr w:type="spellStart"/>
       <w:r>
@@ -123,7 +123,7 @@
           <w:sz w:val="22"/>
           <w:szCs w:val="22"/>
         </w:rPr>
-        <w:t>JupyterNotebooks/Week1/Binary_Representation.ipynb</w:t>
+        <w:t>JupyterNotebooks/Week1/rounding_error_simple.ipynb</w:t>
       </w:r>
       <w:proofErr w:type="spellStart"/>
       <w:r>
@@ -167,7 +167,7 @@
           <w:sz w:val="22"/>
           <w:szCs w:val="22"/>
         </w:rPr>
-        <w:t>to consider the case of 64-bit floating point binary representation.</w:t>
+        <w:t>as a starting point, compare the forward-difference and centered-difference approximations to the derivative of f(x) = sin(x) at x = 1. Use step sizes h = 10^-1, 10^-2, ..., 10^-8 and compare each numerical result with the exact value f'(1) = cos(1). Plot the absolute errors for both methods on the same log-log graph. Over the range where truncation error dominates, estimate the slope of each error curve and determine whether the results are consistent with first-order accuracy for the forward difference and second-order accuracy for the centered difference. Report the step size that gives the smallest error for each method and briefly explain why decreasing h does not always improve the numerical derivative.</w:t>
       </w:r>
     </w:p>
     <w:p>

</xml_diff>